<commit_message>
chore(cll): prepare v2.0 production release
Convert the independently reviewed protected preview to production release presentation, regenerate all controlled artefacts, bind their hashes in the publication manifest, and add the release record. No clinical recommendation changes.
</commit_message>
<xml_diff>
--- a/guidelines/cll/guideline.docx
+++ b/guidelines/cll/guideline.docx
@@ -21,7 +21,7 @@
           <w:color w:val="C41E3A"/>
           <w:sz w:val="22"/>
         </w:rPr>
-        <w:t>Unified clinical guideline — v2.0 relapsed/refractory update preview</w:t>
+        <w:t>Unified clinical guideline — v2.0 relapsed/refractory update</w:t>
       </w:r>
     </w:p>
     <w:p>
@@ -33,7 +33,7 @@
           <w:color w:val="6B7280"/>
           <w:sz w:val="18"/>
         </w:rPr>
-        <w:t>MHA-CLL-2026-v2.0-preview</w:t>
+        <w:t>MHA-CLL-2026-v2.0</w:t>
         <w:br/>
         <w:t>Evidence and access cut-off: 26 July 2026</w:t>
         <w:br/>
@@ -74,7 +74,7 @@
                 <w:color w:val="C41E3A"/>
                 <w:sz w:val="17"/>
               </w:rPr>
-              <w:t>PROTECTED PREVIEW — PHARMACY VERIFICATION COMPLETE — EXACT-ARTEFACT OWNER APPROVAL PENDING</w:t>
+              <w:t>PUBLISHED EDUCATIONAL GUIDELINE — v2.0 — 27 JULY 2026</w:t>
             </w:r>
           </w:p>
         </w:tc>
@@ -104,7 +104,7 @@
     </w:p>
     <w:p>
       <w:r>
-        <w:t>The clinical owner approved the v2.0 update scope on 26 July 2026. Independent review and pharmacy verification are complete. This protected preview remains subject to clinical-owner approval of the exact manifest-bound artefact hashes and separate publication authorisation.</w:t>
+        <w:t>Published 27 July 2026 after independent review, pharmacy verification and clinical-owner approval of the manifest-bound release candidate. This is educational clinical decision support, not a prescribing protocol.</w:t>
       </w:r>
     </w:p>
     <w:p>
@@ -7391,7 +7391,7 @@
           </w:tcPr>
           <w:p>
             <w:r>
-              <w:t>v2.0 preview</w:t>
+              <w:t>v2.0</w:t>
             </w:r>
           </w:p>
         </w:tc>
@@ -7409,7 +7409,7 @@
           </w:tcPr>
           <w:p>
             <w:r>
-              <w:t>26 Jul 2026</w:t>
+              <w:t>27 Jul 2026</w:t>
             </w:r>
           </w:p>
         </w:tc>
@@ -7445,7 +7445,7 @@
           </w:tcPr>
           <w:p>
             <w:r>
-              <w:t>TA1173 and evidence-led R/R sequencing update; exact-artefact approval pending.</w:t>
+              <w:t>Published TA1173 and evidence-led R/R sequencing update.</w:t>
             </w:r>
           </w:p>
         </w:tc>
@@ -7502,7 +7502,7 @@
           </w:tcPr>
           <w:p>
             <w:r>
-              <w:t>MHA-CLL-2026-v2.0-preview</w:t>
+              <w:t>MHA-CLL-2026-v2.0</w:t>
             </w:r>
           </w:p>
         </w:tc>
@@ -7697,7 +7697,7 @@
           </w:tcPr>
           <w:p>
             <w:r>
-              <w:t>PENDING</w:t>
+              <w:t>COMPLETE</w:t>
             </w:r>
           </w:p>
         </w:tc>
@@ -7736,7 +7736,7 @@
           </w:tcPr>
           <w:p>
             <w:r>
-              <w:t>NOT AUTHORISED</w:t>
+              <w:t>AUTHORISED 27 JULY 2026</w:t>
             </w:r>
           </w:p>
         </w:tc>
@@ -7763,7 +7763,7 @@
         <w:color w:val="6B7280"/>
         <w:sz w:val="15"/>
       </w:rPr>
-      <w:t>MHA-CLL-2026-v2.0-preview  |  Full guideline  |  Evidence cut-off 26 July 2026  |  Not yet published</w:t>
+      <w:t>MHA-CLL-2026-v2.0  |  Full guideline  |  Evidence cut-off 26 July 2026  |  Published 27 July 2026</w:t>
     </w:r>
   </w:p>
   <w:p>
@@ -7836,7 +7836,7 @@
               <w:color w:val="FFFFFF"/>
               <w:sz w:val="16"/>
             </w:rPr>
-            <w:t>PROTECTED PREVIEW</w:t>
+            <w:t>PUBLISHED v2.0</w:t>
           </w:r>
         </w:p>
       </w:tc>

</xml_diff>

<commit_message>
fix(cll): harden production release controls
Reject contradictory robots and pending-publication states, avoid overclaiming approval of unratified production hashes, and regenerate the manifest-bound documents. No clinical recommendation changes.
</commit_message>
<xml_diff>
--- a/guidelines/cll/guideline.docx
+++ b/guidelines/cll/guideline.docx
@@ -104,7 +104,7 @@
     </w:p>
     <w:p>
       <w:r>
-        <w:t>Published 27 July 2026 after independent review, pharmacy verification and clinical-owner approval of the manifest-bound release candidate. This is educational clinical decision support, not a prescribing protocol.</w:t>
+        <w:t>Publication authorised 27 July 2026 after independent review, pharmacy verification and clinical-owner approval of the reviewed clinical content. Production artefact hashes are controlled separately in the release record. This is educational clinical decision support, not a prescribing protocol.</w:t>
       </w:r>
     </w:p>
     <w:p>
@@ -7679,7 +7679,7 @@
           </w:tcPr>
           <w:p>
             <w:r>
-              <w:t>Exact-artefact owner approval</w:t>
+              <w:t>Clinical-owner publication authorisation</w:t>
             </w:r>
           </w:p>
         </w:tc>
@@ -7697,7 +7697,7 @@
           </w:tcPr>
           <w:p>
             <w:r>
-              <w:t>COMPLETE</w:t>
+              <w:t>COMPLETE — 27 JULY 2026</w:t>
             </w:r>
           </w:p>
         </w:tc>
@@ -7718,7 +7718,7 @@
           </w:tcPr>
           <w:p>
             <w:r>
-              <w:t>Publication</w:t>
+              <w:t>Production artefact hashes</w:t>
             </w:r>
           </w:p>
         </w:tc>
@@ -7736,7 +7736,7 @@
           </w:tcPr>
           <w:p>
             <w:r>
-              <w:t>AUTHORISED 27 JULY 2026</w:t>
+              <w:t>CONTROLLED IN RELEASE RECORD</w:t>
             </w:r>
           </w:p>
         </w:tc>

</xml_diff>